<commit_message>
update FleetZero cover file
</commit_message>
<xml_diff>
--- a/public/portfolio/Portfolio_Work_at_FleetZero_Jaturaput(Mac)Jongsubcharoen.docx
+++ b/public/portfolio/Portfolio_Work_at_FleetZero_Jaturaput(Mac)Jongsubcharoen.docx
@@ -1,6 +1,6 @@
 
 <file path=word/document.xml><?xml version="1.0" encoding="utf-8"?>
-<w:document xmlns:wpc="http://schemas.microsoft.com/office/word/2010/wordprocessingCanvas" xmlns:cx="http://schemas.microsoft.com/office/drawing/2014/chartex" xmlns:cx1="http://schemas.microsoft.com/office/drawing/2015/9/8/chartex" xmlns:cx2="http://schemas.microsoft.com/office/drawing/2015/10/21/chartex" xmlns:cx3="http://schemas.microsoft.com/office/drawing/2016/5/9/chartex" xmlns:cx4="http://schemas.microsoft.com/office/drawing/2016/5/10/chartex" xmlns:cx5="http://schemas.microsoft.com/office/drawing/2016/5/11/chartex" xmlns:cx6="http://schemas.microsoft.com/office/drawing/2016/5/12/chartex" xmlns:cx7="http://schemas.microsoft.com/office/drawing/2016/5/13/chartex" xmlns:cx8="http://schemas.microsoft.com/office/drawing/2016/5/14/chartex" xmlns:mc="http://schemas.openxmlformats.org/markup-compatibility/2006" xmlns:aink="http://schemas.microsoft.com/office/drawing/2016/ink" xmlns:am3d="http://schemas.microsoft.com/office/drawing/2017/model3d" xmlns:o="urn:schemas-microsoft-com:office:office" xmlns:oel="http://schemas.microsoft.com/office/2019/extlst" xmlns:r="http://schemas.openxmlformats.org/officeDocument/2006/relationships" xmlns:m="http://schemas.openxmlformats.org/officeDocument/2006/math" xmlns:v="urn:schemas-microsoft-com:vml" xmlns:wp14="http://schemas.microsoft.com/office/word/2010/wordprocessingDrawing" xmlns:wp="http://schemas.openxmlformats.org/drawingml/2006/wordprocessingDrawing" xmlns:w10="urn:schemas-microsoft-com:office:word" xmlns:w="http://schemas.openxmlformats.org/wordprocessingml/2006/main" xmlns:w14="http://schemas.microsoft.com/office/word/2010/wordml" xmlns:w15="http://schemas.microsoft.com/office/word/2012/wordml" xmlns:w16cex="http://schemas.microsoft.com/office/word/2018/wordml/cex" xmlns:w16cid="http://schemas.microsoft.com/office/word/2016/wordml/cid" xmlns:w16="http://schemas.microsoft.com/office/word/2018/wordml" xmlns:w16du="http://schemas.microsoft.com/office/word/2023/wordml/word16du" xmlns:w16sdtdh="http://schemas.microsoft.com/office/word/2020/wordml/sdtdatahash" xmlns:w16sdtfl="http://schemas.microsoft.com/office/word/2024/wordml/sdtformatlock" xmlns:w16se="http://schemas.microsoft.com/office/word/2015/wordml/symex" xmlns:wpg="http://schemas.microsoft.com/office/word/2010/wordprocessingGroup" xmlns:wpi="http://schemas.microsoft.com/office/word/2010/wordprocessingInk" xmlns:wne="http://schemas.microsoft.com/office/word/2006/wordml" xmlns:wps="http://schemas.microsoft.com/office/word/2010/wordprocessingShape" mc:Ignorable="w14 w15 w16se w16cid w16 w16cex w16sdtdh w16sdtfl w16du wp14">
+<w:document xmlns:wpc="http://schemas.microsoft.com/office/word/2010/wordprocessingCanvas" xmlns:cx="http://schemas.microsoft.com/office/drawing/2014/chartex" xmlns:cx1="http://schemas.microsoft.com/office/drawing/2015/9/8/chartex" xmlns:cx2="http://schemas.microsoft.com/office/drawing/2015/10/21/chartex" xmlns:cx3="http://schemas.microsoft.com/office/drawing/2016/5/9/chartex" xmlns:cx4="http://schemas.microsoft.com/office/drawing/2016/5/10/chartex" xmlns:cx5="http://schemas.microsoft.com/office/drawing/2016/5/11/chartex" xmlns:cx6="http://schemas.microsoft.com/office/drawing/2016/5/12/chartex" xmlns:cx7="http://schemas.microsoft.com/office/drawing/2016/5/13/chartex" xmlns:cx8="http://schemas.microsoft.com/office/drawing/2016/5/14/chartex" xmlns:mc="http://schemas.openxmlformats.org/markup-compatibility/2006" xmlns:aink="http://schemas.microsoft.com/office/drawing/2016/ink" xmlns:am3d="http://schemas.microsoft.com/office/drawing/2017/model3d" xmlns:o="urn:schemas-microsoft-com:office:office" xmlns:oel="http://schemas.microsoft.com/office/2019/extlst" xmlns:r="http://schemas.openxmlformats.org/officeDocument/2006/relationships" xmlns:m="http://schemas.openxmlformats.org/officeDocument/2006/math" xmlns:v="urn:schemas-microsoft-com:vml" xmlns:wp14="http://schemas.microsoft.com/office/word/2010/wordprocessingDrawing" xmlns:wp="http://schemas.openxmlformats.org/drawingml/2006/wordprocessingDrawing" xmlns:w10="urn:schemas-microsoft-com:office:word" xmlns:w="http://schemas.openxmlformats.org/wordprocessingml/2006/main" xmlns:w14="http://schemas.microsoft.com/office/word/2010/wordml" xmlns:w15="http://schemas.microsoft.com/office/word/2012/wordml" xmlns:w16cei="http://schemas.microsoft.com/office/word/2026/wordml/cei" xmlns:w16cex="http://schemas.microsoft.com/office/word/2018/wordml/cex" xmlns:w16cid="http://schemas.microsoft.com/office/word/2016/wordml/cid" xmlns:w16="http://schemas.microsoft.com/office/word/2018/wordml" xmlns:w16du="http://schemas.microsoft.com/office/word/2023/wordml/word16du" xmlns:w16sdtdh="http://schemas.microsoft.com/office/word/2020/wordml/sdtdatahash" xmlns:w16sdtfl="http://schemas.microsoft.com/office/word/2024/wordml/sdtformatlock" xmlns:w16se="http://schemas.microsoft.com/office/word/2015/wordml/symex" xmlns:wpg="http://schemas.microsoft.com/office/word/2010/wordprocessingGroup" xmlns:wpi="http://schemas.microsoft.com/office/word/2010/wordprocessingInk" xmlns:wne="http://schemas.microsoft.com/office/word/2006/wordml" xmlns:wps="http://schemas.microsoft.com/office/word/2010/wordprocessingShape" mc:Ignorable="w14 w15 w16se w16cid w16 w16cex w16sdtdh w16sdtfl w16du wp14">
   <w:body>
     <w:p>
       <w:pPr>
@@ -264,7 +264,23 @@
           <w:szCs w:val="24"/>
           <w:lang w:val="en-US"/>
         </w:rPr>
-        <w:t xml:space="preserve"> QDM Creative | Toronto, ON | Remote</w:t>
+        <w:t xml:space="preserve"> </w:t>
+      </w:r>
+      <w:r>
+        <w:rPr>
+          <w:rFonts w:ascii="Times New Roman" w:hAnsi="Times New Roman" w:cs="Times New Roman"/>
+          <w:szCs w:val="24"/>
+          <w:lang w:val="en-US"/>
+        </w:rPr>
+        <w:t>FleetZero Inc.</w:t>
+      </w:r>
+      <w:r>
+        <w:rPr>
+          <w:rFonts w:ascii="Times New Roman" w:hAnsi="Times New Roman" w:cs="Times New Roman"/>
+          <w:szCs w:val="24"/>
+          <w:lang w:val="en-US"/>
+        </w:rPr>
+        <w:t xml:space="preserve"> | Toronto, ON | Remote</w:t>
       </w:r>
     </w:p>
     <w:p>
@@ -653,7 +669,27 @@
           <w:szCs w:val="22"/>
           <w:lang w:val="en-US"/>
         </w:rPr>
-        <w:t>The project aimed to:</w:t>
+        <w:t xml:space="preserve">The project aimed </w:t>
+      </w:r>
+      <w:proofErr w:type="gramStart"/>
+      <w:r>
+        <w:rPr>
+          <w:rFonts w:ascii="Times New Roman" w:hAnsi="Times New Roman" w:cs="Times New Roman"/>
+          <w:sz w:val="22"/>
+          <w:szCs w:val="22"/>
+          <w:lang w:val="en-US"/>
+        </w:rPr>
+        <w:t>to</w:t>
+      </w:r>
+      <w:proofErr w:type="gramEnd"/>
+      <w:r>
+        <w:rPr>
+          <w:rFonts w:ascii="Times New Roman" w:hAnsi="Times New Roman" w:cs="Times New Roman"/>
+          <w:sz w:val="22"/>
+          <w:szCs w:val="22"/>
+          <w:lang w:val="en-US"/>
+        </w:rPr>
+        <w:t>:</w:t>
       </w:r>
     </w:p>
     <w:p>
@@ -725,7 +761,47 @@
           <w:szCs w:val="22"/>
           <w:lang w:val="en-US"/>
         </w:rPr>
-        <w:t>Integrate frontend components with backend REST APIs.</w:t>
+        <w:t xml:space="preserve">Integrate </w:t>
+      </w:r>
+      <w:proofErr w:type="gramStart"/>
+      <w:r>
+        <w:rPr>
+          <w:rFonts w:ascii="Times New Roman" w:hAnsi="Times New Roman" w:cs="Times New Roman"/>
+          <w:sz w:val="22"/>
+          <w:szCs w:val="22"/>
+          <w:lang w:val="en-US"/>
+        </w:rPr>
+        <w:t>frontend</w:t>
+      </w:r>
+      <w:proofErr w:type="gramEnd"/>
+      <w:r>
+        <w:rPr>
+          <w:rFonts w:ascii="Times New Roman" w:hAnsi="Times New Roman" w:cs="Times New Roman"/>
+          <w:sz w:val="22"/>
+          <w:szCs w:val="22"/>
+          <w:lang w:val="en-US"/>
+        </w:rPr>
+        <w:t xml:space="preserve"> components with </w:t>
+      </w:r>
+      <w:proofErr w:type="gramStart"/>
+      <w:r>
+        <w:rPr>
+          <w:rFonts w:ascii="Times New Roman" w:hAnsi="Times New Roman" w:cs="Times New Roman"/>
+          <w:sz w:val="22"/>
+          <w:szCs w:val="22"/>
+          <w:lang w:val="en-US"/>
+        </w:rPr>
+        <w:t>backend</w:t>
+      </w:r>
+      <w:proofErr w:type="gramEnd"/>
+      <w:r>
+        <w:rPr>
+          <w:rFonts w:ascii="Times New Roman" w:hAnsi="Times New Roman" w:cs="Times New Roman"/>
+          <w:sz w:val="22"/>
+          <w:szCs w:val="22"/>
+          <w:lang w:val="en-US"/>
+        </w:rPr>
+        <w:t xml:space="preserve"> REST APIs.</w:t>
       </w:r>
     </w:p>
     <w:p>
@@ -1846,7 +1922,25 @@
           <w:sz w:val="22"/>
           <w:szCs w:val="22"/>
         </w:rPr>
-        <w:t>Auth/Guards: auth.guard, roleGuard</w:t>
+        <w:t xml:space="preserve">Auth/Guards: </w:t>
+      </w:r>
+      <w:proofErr w:type="gramStart"/>
+      <w:r>
+        <w:rPr>
+          <w:rFonts w:ascii="Times New Roman" w:hAnsi="Times New Roman" w:cs="Times New Roman"/>
+          <w:sz w:val="22"/>
+          <w:szCs w:val="22"/>
+        </w:rPr>
+        <w:t>auth.guard</w:t>
+      </w:r>
+      <w:proofErr w:type="gramEnd"/>
+      <w:r>
+        <w:rPr>
+          <w:rFonts w:ascii="Times New Roman" w:hAnsi="Times New Roman" w:cs="Times New Roman"/>
+          <w:sz w:val="22"/>
+          <w:szCs w:val="22"/>
+        </w:rPr>
+        <w:t>, roleGuard</w:t>
       </w:r>
     </w:p>
     <w:p>
@@ -1868,7 +1962,25 @@
           <w:sz w:val="22"/>
           <w:szCs w:val="22"/>
         </w:rPr>
-        <w:t>Navigation service: nav.service menus and role-based routing</w:t>
+        <w:t xml:space="preserve">Navigation service: </w:t>
+      </w:r>
+      <w:proofErr w:type="gramStart"/>
+      <w:r>
+        <w:rPr>
+          <w:rFonts w:ascii="Times New Roman" w:hAnsi="Times New Roman" w:cs="Times New Roman"/>
+          <w:sz w:val="22"/>
+          <w:szCs w:val="22"/>
+        </w:rPr>
+        <w:t>nav.service</w:t>
+      </w:r>
+      <w:proofErr w:type="gramEnd"/>
+      <w:r>
+        <w:rPr>
+          <w:rFonts w:ascii="Times New Roman" w:hAnsi="Times New Roman" w:cs="Times New Roman"/>
+          <w:sz w:val="22"/>
+          <w:szCs w:val="22"/>
+        </w:rPr>
+        <w:t xml:space="preserve"> menus and role-based routing</w:t>
       </w:r>
     </w:p>
     <w:p>
@@ -2718,7 +2830,7 @@
           <w:szCs w:val="22"/>
         </w:rPr>
         <w:drawing>
-          <wp:inline distT="0" distB="0" distL="0" distR="0" wp14:anchorId="6F87DE3B" wp14:editId="1415C7D1">
+          <wp:inline distT="0" distB="0" distL="0" distR="0" wp14:anchorId="6F87DE3B" wp14:editId="4DB20055">
             <wp:extent cx="5943600" cy="3343275"/>
             <wp:effectExtent l="0" t="0" r="0" b="9525"/>
             <wp:docPr id="1324247318" name="Picture 3"/>
@@ -2792,7 +2904,25 @@
           <w:sz w:val="22"/>
           <w:szCs w:val="22"/>
         </w:rPr>
-        <w:t>Fix Angular dependency alignment (Angular 19 compatibility) After pulling latest main code from Adiya’s code. Removed @kolkov/angular-editor (Angular 20+ peer conflict). Pinned ng-apexcharts to 1.15.0 (Angular 19 compatible). Aligned @angular/material, @angular/cdk, @angular/localize to 19.2.18</w:t>
+        <w:t>Fix Angular dependency alignment (Angular 19 compatibility) After pulling latest main code from Adiya’s code. Removed @kolkov/</w:t>
+      </w:r>
+      <w:proofErr w:type="gramStart"/>
+      <w:r>
+        <w:rPr>
+          <w:rFonts w:ascii="Times New Roman" w:hAnsi="Times New Roman" w:cs="Times New Roman"/>
+          <w:sz w:val="22"/>
+          <w:szCs w:val="22"/>
+        </w:rPr>
+        <w:t>angular-editor</w:t>
+      </w:r>
+      <w:proofErr w:type="gramEnd"/>
+      <w:r>
+        <w:rPr>
+          <w:rFonts w:ascii="Times New Roman" w:hAnsi="Times New Roman" w:cs="Times New Roman"/>
+          <w:sz w:val="22"/>
+          <w:szCs w:val="22"/>
+        </w:rPr>
+        <w:t xml:space="preserve"> (Angular 20+ peer conflict). Pinned ng-apexcharts to 1.15.0 (Angular 19 compatible). Aligned @angular/material, @angular/cdk, @angular/localize to 19.2.18</w:t>
       </w:r>
     </w:p>
     <w:p>
@@ -3623,15 +3753,51 @@
           <w:sz w:val="22"/>
           <w:szCs w:val="22"/>
         </w:rPr>
-        <w:t>Updated dashboard.component.ts</w:t>
-      </w:r>
-      <w:r>
-        <w:rPr>
-          <w:rFonts w:ascii="Times New Roman" w:hAnsi="Times New Roman" w:cs="Times New Roman"/>
-          <w:sz w:val="22"/>
-          <w:szCs w:val="22"/>
-        </w:rPr>
-        <w:t>, making refreshClientView() now requests ticket totals for project/vehicle combinations (single-project, all-projects aggregation, and vehicle-scoped queries). Total Assets computed from vehicle lists:</w:t>
+        <w:t xml:space="preserve">Updated </w:t>
+      </w:r>
+      <w:proofErr w:type="gramStart"/>
+      <w:r>
+        <w:rPr>
+          <w:rFonts w:ascii="Times New Roman" w:hAnsi="Times New Roman" w:cs="Times New Roman"/>
+          <w:sz w:val="22"/>
+          <w:szCs w:val="22"/>
+        </w:rPr>
+        <w:t>dashboard.component</w:t>
+      </w:r>
+      <w:proofErr w:type="gramEnd"/>
+      <w:r>
+        <w:rPr>
+          <w:rFonts w:ascii="Times New Roman" w:hAnsi="Times New Roman" w:cs="Times New Roman"/>
+          <w:sz w:val="22"/>
+          <w:szCs w:val="22"/>
+        </w:rPr>
+        <w:t>.ts</w:t>
+      </w:r>
+      <w:r>
+        <w:rPr>
+          <w:rFonts w:ascii="Times New Roman" w:hAnsi="Times New Roman" w:cs="Times New Roman"/>
+          <w:sz w:val="22"/>
+          <w:szCs w:val="22"/>
+        </w:rPr>
+        <w:t xml:space="preserve">, making </w:t>
+      </w:r>
+      <w:proofErr w:type="gramStart"/>
+      <w:r>
+        <w:rPr>
+          <w:rFonts w:ascii="Times New Roman" w:hAnsi="Times New Roman" w:cs="Times New Roman"/>
+          <w:sz w:val="22"/>
+          <w:szCs w:val="22"/>
+        </w:rPr>
+        <w:t>refreshClientView(</w:t>
+      </w:r>
+      <w:proofErr w:type="gramEnd"/>
+      <w:r>
+        <w:rPr>
+          <w:rFonts w:ascii="Times New Roman" w:hAnsi="Times New Roman" w:cs="Times New Roman"/>
+          <w:sz w:val="22"/>
+          <w:szCs w:val="22"/>
+        </w:rPr>
+        <w:t>) now requests ticket totals for project/vehicle combinations (single-project, all-projects aggregation, and vehicle-scoped queries). Total Assets computed from vehicle lists:</w:t>
       </w:r>
     </w:p>
     <w:p>
@@ -4344,7 +4510,7 @@
           <w:szCs w:val="22"/>
         </w:rPr>
         <w:drawing>
-          <wp:inline distT="0" distB="0" distL="0" distR="0" wp14:anchorId="1E0E4A4B" wp14:editId="7797C2B6">
+          <wp:inline distT="0" distB="0" distL="0" distR="0" wp14:anchorId="1E0E4A4B" wp14:editId="264F5D10">
             <wp:extent cx="5943600" cy="2252345"/>
             <wp:effectExtent l="0" t="0" r="0" b="0"/>
             <wp:docPr id="202458545" name="Picture 7"/>
@@ -4732,7 +4898,25 @@
           <w:szCs w:val="22"/>
         </w:rPr>
         <w:br/>
-        <w:t>Updated the Client Dashboard behavior so the "Vehicle Station Tracking" widget is hidden when the default filters are: “Filter by Project = All Projects” and “ Filter by Vehicle = All Vehicles”</w:t>
+        <w:t xml:space="preserve">Updated the Client Dashboard behavior so the "Vehicle Station Tracking" widget is hidden when the default filters are: “Filter by Project = All Projects” and </w:t>
+      </w:r>
+      <w:proofErr w:type="gramStart"/>
+      <w:r>
+        <w:rPr>
+          <w:rFonts w:ascii="Times New Roman" w:hAnsi="Times New Roman" w:cs="Times New Roman"/>
+          <w:sz w:val="22"/>
+          <w:szCs w:val="22"/>
+        </w:rPr>
+        <w:t>“ Filter</w:t>
+      </w:r>
+      <w:proofErr w:type="gramEnd"/>
+      <w:r>
+        <w:rPr>
+          <w:rFonts w:ascii="Times New Roman" w:hAnsi="Times New Roman" w:cs="Times New Roman"/>
+          <w:sz w:val="22"/>
+          <w:szCs w:val="22"/>
+        </w:rPr>
+        <w:t xml:space="preserve"> by Vehicle = All Vehicles”</w:t>
       </w:r>
     </w:p>
     <w:p>
@@ -4768,7 +4952,25 @@
           <w:sz w:val="22"/>
           <w:szCs w:val="22"/>
         </w:rPr>
-        <w:t>Improved the Repeated Defects percent resolution logic by adding normalizePercentValue() to handle ratio-style values returned by the API, adding repeatedTickets reader handling, using repeatedPercent when available and valid, computing percent from repeatedTickets / totalTickets when repeatedPercent is missing or unreliable, and using weighted calculation for array responses when needed</w:t>
+        <w:t xml:space="preserve">Improved the Repeated Defects percent resolution logic by adding </w:t>
+      </w:r>
+      <w:proofErr w:type="gramStart"/>
+      <w:r>
+        <w:rPr>
+          <w:rFonts w:ascii="Times New Roman" w:hAnsi="Times New Roman" w:cs="Times New Roman"/>
+          <w:sz w:val="22"/>
+          <w:szCs w:val="22"/>
+        </w:rPr>
+        <w:t>normalizePercentValue(</w:t>
+      </w:r>
+      <w:proofErr w:type="gramEnd"/>
+      <w:r>
+        <w:rPr>
+          <w:rFonts w:ascii="Times New Roman" w:hAnsi="Times New Roman" w:cs="Times New Roman"/>
+          <w:sz w:val="22"/>
+          <w:szCs w:val="22"/>
+        </w:rPr>
+        <w:t>) to handle ratio-style values returned by the API, adding repeatedTickets reader handling, using repeatedPercent when available and valid, computing percent from repeatedTickets / totalTickets when repeatedPercent is missing or unreliable, and using weighted calculation for array responses when needed</w:t>
       </w:r>
       <w:r>
         <w:rPr>
@@ -5135,7 +5337,7 @@
           <w:szCs w:val="22"/>
         </w:rPr>
         <w:drawing>
-          <wp:inline distT="0" distB="0" distL="0" distR="0" wp14:anchorId="024CFAC6" wp14:editId="7E17F17A">
+          <wp:inline distT="0" distB="0" distL="0" distR="0" wp14:anchorId="024CFAC6" wp14:editId="3BB4E8AF">
             <wp:extent cx="5934710" cy="3070860"/>
             <wp:effectExtent l="0" t="0" r="8890" b="0"/>
             <wp:docPr id="225330363" name="Picture 3"/>
@@ -5382,7 +5584,7 @@
           <w:szCs w:val="22"/>
         </w:rPr>
         <w:drawing>
-          <wp:inline distT="0" distB="0" distL="0" distR="0" wp14:anchorId="4B086B5D" wp14:editId="4EE68F65">
+          <wp:inline distT="0" distB="0" distL="0" distR="0" wp14:anchorId="4B086B5D" wp14:editId="63E3F82E">
             <wp:extent cx="5939790" cy="3204210"/>
             <wp:effectExtent l="0" t="0" r="3810" b="0"/>
             <wp:docPr id="774384938" name="Picture 1"/>
@@ -5458,7 +5660,7 @@
           <w:szCs w:val="22"/>
         </w:rPr>
         <w:drawing>
-          <wp:inline distT="0" distB="0" distL="0" distR="0" wp14:anchorId="6B2C698B" wp14:editId="380264EC">
+          <wp:inline distT="0" distB="0" distL="0" distR="0" wp14:anchorId="6B2C698B" wp14:editId="01097BEE">
             <wp:extent cx="5939790" cy="3339465"/>
             <wp:effectExtent l="0" t="0" r="3810" b="0"/>
             <wp:docPr id="891513641" name="Picture 2"/>
@@ -5584,7 +5786,7 @@
 </file>
 
 <file path=word/endnotes.xml><?xml version="1.0" encoding="utf-8"?>
-<w:endnotes xmlns:wpc="http://schemas.microsoft.com/office/word/2010/wordprocessingCanvas" xmlns:cx="http://schemas.microsoft.com/office/drawing/2014/chartex" xmlns:cx1="http://schemas.microsoft.com/office/drawing/2015/9/8/chartex" xmlns:cx2="http://schemas.microsoft.com/office/drawing/2015/10/21/chartex" xmlns:cx3="http://schemas.microsoft.com/office/drawing/2016/5/9/chartex" xmlns:cx4="http://schemas.microsoft.com/office/drawing/2016/5/10/chartex" xmlns:cx5="http://schemas.microsoft.com/office/drawing/2016/5/11/chartex" xmlns:cx6="http://schemas.microsoft.com/office/drawing/2016/5/12/chartex" xmlns:cx7="http://schemas.microsoft.com/office/drawing/2016/5/13/chartex" xmlns:cx8="http://schemas.microsoft.com/office/drawing/2016/5/14/chartex" xmlns:mc="http://schemas.openxmlformats.org/markup-compatibility/2006" xmlns:aink="http://schemas.microsoft.com/office/drawing/2016/ink" xmlns:am3d="http://schemas.microsoft.com/office/drawing/2017/model3d" xmlns:o="urn:schemas-microsoft-com:office:office" xmlns:oel="http://schemas.microsoft.com/office/2019/extlst" xmlns:r="http://schemas.openxmlformats.org/officeDocument/2006/relationships" xmlns:m="http://schemas.openxmlformats.org/officeDocument/2006/math" xmlns:v="urn:schemas-microsoft-com:vml" xmlns:wp14="http://schemas.microsoft.com/office/word/2010/wordprocessingDrawing" xmlns:wp="http://schemas.openxmlformats.org/drawingml/2006/wordprocessingDrawing" xmlns:w10="urn:schemas-microsoft-com:office:word" xmlns:w="http://schemas.openxmlformats.org/wordprocessingml/2006/main" xmlns:w14="http://schemas.microsoft.com/office/word/2010/wordml" xmlns:w15="http://schemas.microsoft.com/office/word/2012/wordml" xmlns:w16cex="http://schemas.microsoft.com/office/word/2018/wordml/cex" xmlns:w16cid="http://schemas.microsoft.com/office/word/2016/wordml/cid" xmlns:w16="http://schemas.microsoft.com/office/word/2018/wordml" xmlns:w16du="http://schemas.microsoft.com/office/word/2023/wordml/word16du" xmlns:w16sdtdh="http://schemas.microsoft.com/office/word/2020/wordml/sdtdatahash" xmlns:w16sdtfl="http://schemas.microsoft.com/office/word/2024/wordml/sdtformatlock" xmlns:w16se="http://schemas.microsoft.com/office/word/2015/wordml/symex" xmlns:wpg="http://schemas.microsoft.com/office/word/2010/wordprocessingGroup" xmlns:wpi="http://schemas.microsoft.com/office/word/2010/wordprocessingInk" xmlns:wne="http://schemas.microsoft.com/office/word/2006/wordml" xmlns:wps="http://schemas.microsoft.com/office/word/2010/wordprocessingShape" mc:Ignorable="w14 w15 w16se w16cid w16 w16cex w16sdtdh w16sdtfl w16du wp14">
+<w:endnotes xmlns:wpc="http://schemas.microsoft.com/office/word/2010/wordprocessingCanvas" xmlns:cx="http://schemas.microsoft.com/office/drawing/2014/chartex" xmlns:cx1="http://schemas.microsoft.com/office/drawing/2015/9/8/chartex" xmlns:cx2="http://schemas.microsoft.com/office/drawing/2015/10/21/chartex" xmlns:cx3="http://schemas.microsoft.com/office/drawing/2016/5/9/chartex" xmlns:cx4="http://schemas.microsoft.com/office/drawing/2016/5/10/chartex" xmlns:cx5="http://schemas.microsoft.com/office/drawing/2016/5/11/chartex" xmlns:cx6="http://schemas.microsoft.com/office/drawing/2016/5/12/chartex" xmlns:cx7="http://schemas.microsoft.com/office/drawing/2016/5/13/chartex" xmlns:cx8="http://schemas.microsoft.com/office/drawing/2016/5/14/chartex" xmlns:mc="http://schemas.openxmlformats.org/markup-compatibility/2006" xmlns:aink="http://schemas.microsoft.com/office/drawing/2016/ink" xmlns:am3d="http://schemas.microsoft.com/office/drawing/2017/model3d" xmlns:o="urn:schemas-microsoft-com:office:office" xmlns:oel="http://schemas.microsoft.com/office/2019/extlst" xmlns:r="http://schemas.openxmlformats.org/officeDocument/2006/relationships" xmlns:m="http://schemas.openxmlformats.org/officeDocument/2006/math" xmlns:v="urn:schemas-microsoft-com:vml" xmlns:wp14="http://schemas.microsoft.com/office/word/2010/wordprocessingDrawing" xmlns:wp="http://schemas.openxmlformats.org/drawingml/2006/wordprocessingDrawing" xmlns:w10="urn:schemas-microsoft-com:office:word" xmlns:w="http://schemas.openxmlformats.org/wordprocessingml/2006/main" xmlns:w14="http://schemas.microsoft.com/office/word/2010/wordml" xmlns:w15="http://schemas.microsoft.com/office/word/2012/wordml" xmlns:w16cei="http://schemas.microsoft.com/office/word/2026/wordml/cei" xmlns:w16cex="http://schemas.microsoft.com/office/word/2018/wordml/cex" xmlns:w16cid="http://schemas.microsoft.com/office/word/2016/wordml/cid" xmlns:w16="http://schemas.microsoft.com/office/word/2018/wordml" xmlns:w16du="http://schemas.microsoft.com/office/word/2023/wordml/word16du" xmlns:w16sdtdh="http://schemas.microsoft.com/office/word/2020/wordml/sdtdatahash" xmlns:w16sdtfl="http://schemas.microsoft.com/office/word/2024/wordml/sdtformatlock" xmlns:w16se="http://schemas.microsoft.com/office/word/2015/wordml/symex" xmlns:wpg="http://schemas.microsoft.com/office/word/2010/wordprocessingGroup" xmlns:wpi="http://schemas.microsoft.com/office/word/2010/wordprocessingInk" xmlns:wne="http://schemas.microsoft.com/office/word/2006/wordml" xmlns:wps="http://schemas.microsoft.com/office/word/2010/wordprocessingShape" mc:Ignorable="w14 w15 w16se w16cid w16 w16cex w16sdtdh w16sdtfl w16du wp14">
   <w:endnote w:type="separator" w:id="-1">
     <w:p>
       <w:pPr>
@@ -5609,7 +5811,7 @@
 </file>
 
 <file path=word/footnotes.xml><?xml version="1.0" encoding="utf-8"?>
-<w:footnotes xmlns:wpc="http://schemas.microsoft.com/office/word/2010/wordprocessingCanvas" xmlns:cx="http://schemas.microsoft.com/office/drawing/2014/chartex" xmlns:cx1="http://schemas.microsoft.com/office/drawing/2015/9/8/chartex" xmlns:cx2="http://schemas.microsoft.com/office/drawing/2015/10/21/chartex" xmlns:cx3="http://schemas.microsoft.com/office/drawing/2016/5/9/chartex" xmlns:cx4="http://schemas.microsoft.com/office/drawing/2016/5/10/chartex" xmlns:cx5="http://schemas.microsoft.com/office/drawing/2016/5/11/chartex" xmlns:cx6="http://schemas.microsoft.com/office/drawing/2016/5/12/chartex" xmlns:cx7="http://schemas.microsoft.com/office/drawing/2016/5/13/chartex" xmlns:cx8="http://schemas.microsoft.com/office/drawing/2016/5/14/chartex" xmlns:mc="http://schemas.openxmlformats.org/markup-compatibility/2006" xmlns:aink="http://schemas.microsoft.com/office/drawing/2016/ink" xmlns:am3d="http://schemas.microsoft.com/office/drawing/2017/model3d" xmlns:o="urn:schemas-microsoft-com:office:office" xmlns:oel="http://schemas.microsoft.com/office/2019/extlst" xmlns:r="http://schemas.openxmlformats.org/officeDocument/2006/relationships" xmlns:m="http://schemas.openxmlformats.org/officeDocument/2006/math" xmlns:v="urn:schemas-microsoft-com:vml" xmlns:wp14="http://schemas.microsoft.com/office/word/2010/wordprocessingDrawing" xmlns:wp="http://schemas.openxmlformats.org/drawingml/2006/wordprocessingDrawing" xmlns:w10="urn:schemas-microsoft-com:office:word" xmlns:w="http://schemas.openxmlformats.org/wordprocessingml/2006/main" xmlns:w14="http://schemas.microsoft.com/office/word/2010/wordml" xmlns:w15="http://schemas.microsoft.com/office/word/2012/wordml" xmlns:w16cex="http://schemas.microsoft.com/office/word/2018/wordml/cex" xmlns:w16cid="http://schemas.microsoft.com/office/word/2016/wordml/cid" xmlns:w16="http://schemas.microsoft.com/office/word/2018/wordml" xmlns:w16du="http://schemas.microsoft.com/office/word/2023/wordml/word16du" xmlns:w16sdtdh="http://schemas.microsoft.com/office/word/2020/wordml/sdtdatahash" xmlns:w16sdtfl="http://schemas.microsoft.com/office/word/2024/wordml/sdtformatlock" xmlns:w16se="http://schemas.microsoft.com/office/word/2015/wordml/symex" xmlns:wpg="http://schemas.microsoft.com/office/word/2010/wordprocessingGroup" xmlns:wpi="http://schemas.microsoft.com/office/word/2010/wordprocessingInk" xmlns:wne="http://schemas.microsoft.com/office/word/2006/wordml" xmlns:wps="http://schemas.microsoft.com/office/word/2010/wordprocessingShape" mc:Ignorable="w14 w15 w16se w16cid w16 w16cex w16sdtdh w16sdtfl w16du wp14">
+<w:footnotes xmlns:wpc="http://schemas.microsoft.com/office/word/2010/wordprocessingCanvas" xmlns:cx="http://schemas.microsoft.com/office/drawing/2014/chartex" xmlns:cx1="http://schemas.microsoft.com/office/drawing/2015/9/8/chartex" xmlns:cx2="http://schemas.microsoft.com/office/drawing/2015/10/21/chartex" xmlns:cx3="http://schemas.microsoft.com/office/drawing/2016/5/9/chartex" xmlns:cx4="http://schemas.microsoft.com/office/drawing/2016/5/10/chartex" xmlns:cx5="http://schemas.microsoft.com/office/drawing/2016/5/11/chartex" xmlns:cx6="http://schemas.microsoft.com/office/drawing/2016/5/12/chartex" xmlns:cx7="http://schemas.microsoft.com/office/drawing/2016/5/13/chartex" xmlns:cx8="http://schemas.microsoft.com/office/drawing/2016/5/14/chartex" xmlns:mc="http://schemas.openxmlformats.org/markup-compatibility/2006" xmlns:aink="http://schemas.microsoft.com/office/drawing/2016/ink" xmlns:am3d="http://schemas.microsoft.com/office/drawing/2017/model3d" xmlns:o="urn:schemas-microsoft-com:office:office" xmlns:oel="http://schemas.microsoft.com/office/2019/extlst" xmlns:r="http://schemas.openxmlformats.org/officeDocument/2006/relationships" xmlns:m="http://schemas.openxmlformats.org/officeDocument/2006/math" xmlns:v="urn:schemas-microsoft-com:vml" xmlns:wp14="http://schemas.microsoft.com/office/word/2010/wordprocessingDrawing" xmlns:wp="http://schemas.openxmlformats.org/drawingml/2006/wordprocessingDrawing" xmlns:w10="urn:schemas-microsoft-com:office:word" xmlns:w="http://schemas.openxmlformats.org/wordprocessingml/2006/main" xmlns:w14="http://schemas.microsoft.com/office/word/2010/wordml" xmlns:w15="http://schemas.microsoft.com/office/word/2012/wordml" xmlns:w16cei="http://schemas.microsoft.com/office/word/2026/wordml/cei" xmlns:w16cex="http://schemas.microsoft.com/office/word/2018/wordml/cex" xmlns:w16cid="http://schemas.microsoft.com/office/word/2016/wordml/cid" xmlns:w16="http://schemas.microsoft.com/office/word/2018/wordml" xmlns:w16du="http://schemas.microsoft.com/office/word/2023/wordml/word16du" xmlns:w16sdtdh="http://schemas.microsoft.com/office/word/2020/wordml/sdtdatahash" xmlns:w16sdtfl="http://schemas.microsoft.com/office/word/2024/wordml/sdtformatlock" xmlns:w16se="http://schemas.microsoft.com/office/word/2015/wordml/symex" xmlns:wpg="http://schemas.microsoft.com/office/word/2010/wordprocessingGroup" xmlns:wpi="http://schemas.microsoft.com/office/word/2010/wordprocessingInk" xmlns:wne="http://schemas.microsoft.com/office/word/2006/wordml" xmlns:wps="http://schemas.microsoft.com/office/word/2010/wordprocessingShape" mc:Ignorable="w14 w15 w16se w16cid w16 w16cex w16sdtdh w16sdtfl w16du wp14">
   <w:footnote w:type="separator" w:id="-1">
     <w:p>
       <w:pPr>
@@ -5634,7 +5836,7 @@
 </file>
 
 <file path=word/header1.xml><?xml version="1.0" encoding="utf-8"?>
-<w:hdr xmlns:wpc="http://schemas.microsoft.com/office/word/2010/wordprocessingCanvas" xmlns:cx="http://schemas.microsoft.com/office/drawing/2014/chartex" xmlns:cx1="http://schemas.microsoft.com/office/drawing/2015/9/8/chartex" xmlns:cx2="http://schemas.microsoft.com/office/drawing/2015/10/21/chartex" xmlns:cx3="http://schemas.microsoft.com/office/drawing/2016/5/9/chartex" xmlns:cx4="http://schemas.microsoft.com/office/drawing/2016/5/10/chartex" xmlns:cx5="http://schemas.microsoft.com/office/drawing/2016/5/11/chartex" xmlns:cx6="http://schemas.microsoft.com/office/drawing/2016/5/12/chartex" xmlns:cx7="http://schemas.microsoft.com/office/drawing/2016/5/13/chartex" xmlns:cx8="http://schemas.microsoft.com/office/drawing/2016/5/14/chartex" xmlns:mc="http://schemas.openxmlformats.org/markup-compatibility/2006" xmlns:aink="http://schemas.microsoft.com/office/drawing/2016/ink" xmlns:am3d="http://schemas.microsoft.com/office/drawing/2017/model3d" xmlns:o="urn:schemas-microsoft-com:office:office" xmlns:oel="http://schemas.microsoft.com/office/2019/extlst" xmlns:r="http://schemas.openxmlformats.org/officeDocument/2006/relationships" xmlns:m="http://schemas.openxmlformats.org/officeDocument/2006/math" xmlns:v="urn:schemas-microsoft-com:vml" xmlns:wp14="http://schemas.microsoft.com/office/word/2010/wordprocessingDrawing" xmlns:wp="http://schemas.openxmlformats.org/drawingml/2006/wordprocessingDrawing" xmlns:w10="urn:schemas-microsoft-com:office:word" xmlns:w="http://schemas.openxmlformats.org/wordprocessingml/2006/main" xmlns:w14="http://schemas.microsoft.com/office/word/2010/wordml" xmlns:w15="http://schemas.microsoft.com/office/word/2012/wordml" xmlns:w16cex="http://schemas.microsoft.com/office/word/2018/wordml/cex" xmlns:w16cid="http://schemas.microsoft.com/office/word/2016/wordml/cid" xmlns:w16="http://schemas.microsoft.com/office/word/2018/wordml" xmlns:w16du="http://schemas.microsoft.com/office/word/2023/wordml/word16du" xmlns:w16sdtdh="http://schemas.microsoft.com/office/word/2020/wordml/sdtdatahash" xmlns:w16sdtfl="http://schemas.microsoft.com/office/word/2024/wordml/sdtformatlock" xmlns:w16se="http://schemas.microsoft.com/office/word/2015/wordml/symex" xmlns:wpg="http://schemas.microsoft.com/office/word/2010/wordprocessingGroup" xmlns:wpi="http://schemas.microsoft.com/office/word/2010/wordprocessingInk" xmlns:wne="http://schemas.microsoft.com/office/word/2006/wordml" xmlns:wps="http://schemas.microsoft.com/office/word/2010/wordprocessingShape" mc:Ignorable="w14 w15 w16se w16cid w16 w16cex w16sdtdh w16sdtfl w16du wp14">
+<w:hdr xmlns:wpc="http://schemas.microsoft.com/office/word/2010/wordprocessingCanvas" xmlns:cx="http://schemas.microsoft.com/office/drawing/2014/chartex" xmlns:cx1="http://schemas.microsoft.com/office/drawing/2015/9/8/chartex" xmlns:cx2="http://schemas.microsoft.com/office/drawing/2015/10/21/chartex" xmlns:cx3="http://schemas.microsoft.com/office/drawing/2016/5/9/chartex" xmlns:cx4="http://schemas.microsoft.com/office/drawing/2016/5/10/chartex" xmlns:cx5="http://schemas.microsoft.com/office/drawing/2016/5/11/chartex" xmlns:cx6="http://schemas.microsoft.com/office/drawing/2016/5/12/chartex" xmlns:cx7="http://schemas.microsoft.com/office/drawing/2016/5/13/chartex" xmlns:cx8="http://schemas.microsoft.com/office/drawing/2016/5/14/chartex" xmlns:mc="http://schemas.openxmlformats.org/markup-compatibility/2006" xmlns:aink="http://schemas.microsoft.com/office/drawing/2016/ink" xmlns:am3d="http://schemas.microsoft.com/office/drawing/2017/model3d" xmlns:o="urn:schemas-microsoft-com:office:office" xmlns:oel="http://schemas.microsoft.com/office/2019/extlst" xmlns:r="http://schemas.openxmlformats.org/officeDocument/2006/relationships" xmlns:m="http://schemas.openxmlformats.org/officeDocument/2006/math" xmlns:v="urn:schemas-microsoft-com:vml" xmlns:wp14="http://schemas.microsoft.com/office/word/2010/wordprocessingDrawing" xmlns:wp="http://schemas.openxmlformats.org/drawingml/2006/wordprocessingDrawing" xmlns:w10="urn:schemas-microsoft-com:office:word" xmlns:w="http://schemas.openxmlformats.org/wordprocessingml/2006/main" xmlns:w14="http://schemas.microsoft.com/office/word/2010/wordml" xmlns:w15="http://schemas.microsoft.com/office/word/2012/wordml" xmlns:w16cei="http://schemas.microsoft.com/office/word/2026/wordml/cei" xmlns:w16cex="http://schemas.microsoft.com/office/word/2018/wordml/cex" xmlns:w16cid="http://schemas.microsoft.com/office/word/2016/wordml/cid" xmlns:w16="http://schemas.microsoft.com/office/word/2018/wordml" xmlns:w16du="http://schemas.microsoft.com/office/word/2023/wordml/word16du" xmlns:w16sdtdh="http://schemas.microsoft.com/office/word/2020/wordml/sdtdatahash" xmlns:w16sdtfl="http://schemas.microsoft.com/office/word/2024/wordml/sdtformatlock" xmlns:w16se="http://schemas.microsoft.com/office/word/2015/wordml/symex" xmlns:wpg="http://schemas.microsoft.com/office/word/2010/wordprocessingGroup" xmlns:wpi="http://schemas.microsoft.com/office/word/2010/wordprocessingInk" xmlns:wne="http://schemas.microsoft.com/office/word/2006/wordml" xmlns:wps="http://schemas.microsoft.com/office/word/2010/wordprocessingShape" mc:Ignorable="w14 w15 w16se w16cid w16 w16cex w16sdtdh w16sdtfl w16du wp14">
   <w:sdt>
     <w:sdtPr>
       <w:id w:val="-81609118"/>
@@ -5687,7 +5889,7 @@
 </file>
 
 <file path=word/numbering.xml><?xml version="1.0" encoding="utf-8"?>
-<w:numbering xmlns:wpc="http://schemas.microsoft.com/office/word/2010/wordprocessingCanvas" xmlns:cx="http://schemas.microsoft.com/office/drawing/2014/chartex" xmlns:cx1="http://schemas.microsoft.com/office/drawing/2015/9/8/chartex" xmlns:cx2="http://schemas.microsoft.com/office/drawing/2015/10/21/chartex" xmlns:cx3="http://schemas.microsoft.com/office/drawing/2016/5/9/chartex" xmlns:cx4="http://schemas.microsoft.com/office/drawing/2016/5/10/chartex" xmlns:cx5="http://schemas.microsoft.com/office/drawing/2016/5/11/chartex" xmlns:cx6="http://schemas.microsoft.com/office/drawing/2016/5/12/chartex" xmlns:cx7="http://schemas.microsoft.com/office/drawing/2016/5/13/chartex" xmlns:cx8="http://schemas.microsoft.com/office/drawing/2016/5/14/chartex" xmlns:mc="http://schemas.openxmlformats.org/markup-compatibility/2006" xmlns:aink="http://schemas.microsoft.com/office/drawing/2016/ink" xmlns:am3d="http://schemas.microsoft.com/office/drawing/2017/model3d" xmlns:o="urn:schemas-microsoft-com:office:office" xmlns:oel="http://schemas.microsoft.com/office/2019/extlst" xmlns:r="http://schemas.openxmlformats.org/officeDocument/2006/relationships" xmlns:m="http://schemas.openxmlformats.org/officeDocument/2006/math" xmlns:v="urn:schemas-microsoft-com:vml" xmlns:wp14="http://schemas.microsoft.com/office/word/2010/wordprocessingDrawing" xmlns:wp="http://schemas.openxmlformats.org/drawingml/2006/wordprocessingDrawing" xmlns:w10="urn:schemas-microsoft-com:office:word" xmlns:w="http://schemas.openxmlformats.org/wordprocessingml/2006/main" xmlns:w14="http://schemas.microsoft.com/office/word/2010/wordml" xmlns:w15="http://schemas.microsoft.com/office/word/2012/wordml" xmlns:w16cex="http://schemas.microsoft.com/office/word/2018/wordml/cex" xmlns:w16cid="http://schemas.microsoft.com/office/word/2016/wordml/cid" xmlns:w16="http://schemas.microsoft.com/office/word/2018/wordml" xmlns:w16du="http://schemas.microsoft.com/office/word/2023/wordml/word16du" xmlns:w16sdtdh="http://schemas.microsoft.com/office/word/2020/wordml/sdtdatahash" xmlns:w16sdtfl="http://schemas.microsoft.com/office/word/2024/wordml/sdtformatlock" xmlns:w16se="http://schemas.microsoft.com/office/word/2015/wordml/symex" xmlns:wpg="http://schemas.microsoft.com/office/word/2010/wordprocessingGroup" xmlns:wpi="http://schemas.microsoft.com/office/word/2010/wordprocessingInk" xmlns:wne="http://schemas.microsoft.com/office/word/2006/wordml" xmlns:wps="http://schemas.microsoft.com/office/word/2010/wordprocessingShape" mc:Ignorable="w14 w15 w16se w16cid w16 w16cex w16sdtdh w16sdtfl w16du wp14">
+<w:numbering xmlns:wpc="http://schemas.microsoft.com/office/word/2010/wordprocessingCanvas" xmlns:cx="http://schemas.microsoft.com/office/drawing/2014/chartex" xmlns:cx1="http://schemas.microsoft.com/office/drawing/2015/9/8/chartex" xmlns:cx2="http://schemas.microsoft.com/office/drawing/2015/10/21/chartex" xmlns:cx3="http://schemas.microsoft.com/office/drawing/2016/5/9/chartex" xmlns:cx4="http://schemas.microsoft.com/office/drawing/2016/5/10/chartex" xmlns:cx5="http://schemas.microsoft.com/office/drawing/2016/5/11/chartex" xmlns:cx6="http://schemas.microsoft.com/office/drawing/2016/5/12/chartex" xmlns:cx7="http://schemas.microsoft.com/office/drawing/2016/5/13/chartex" xmlns:cx8="http://schemas.microsoft.com/office/drawing/2016/5/14/chartex" xmlns:mc="http://schemas.openxmlformats.org/markup-compatibility/2006" xmlns:aink="http://schemas.microsoft.com/office/drawing/2016/ink" xmlns:am3d="http://schemas.microsoft.com/office/drawing/2017/model3d" xmlns:o="urn:schemas-microsoft-com:office:office" xmlns:oel="http://schemas.microsoft.com/office/2019/extlst" xmlns:r="http://schemas.openxmlformats.org/officeDocument/2006/relationships" xmlns:m="http://schemas.openxmlformats.org/officeDocument/2006/math" xmlns:v="urn:schemas-microsoft-com:vml" xmlns:wp14="http://schemas.microsoft.com/office/word/2010/wordprocessingDrawing" xmlns:wp="http://schemas.openxmlformats.org/drawingml/2006/wordprocessingDrawing" xmlns:w10="urn:schemas-microsoft-com:office:word" xmlns:w="http://schemas.openxmlformats.org/wordprocessingml/2006/main" xmlns:w14="http://schemas.microsoft.com/office/word/2010/wordml" xmlns:w15="http://schemas.microsoft.com/office/word/2012/wordml" xmlns:w16cei="http://schemas.microsoft.com/office/word/2026/wordml/cei" xmlns:w16cex="http://schemas.microsoft.com/office/word/2018/wordml/cex" xmlns:w16cid="http://schemas.microsoft.com/office/word/2016/wordml/cid" xmlns:w16="http://schemas.microsoft.com/office/word/2018/wordml" xmlns:w16du="http://schemas.microsoft.com/office/word/2023/wordml/word16du" xmlns:w16sdtdh="http://schemas.microsoft.com/office/word/2020/wordml/sdtdatahash" xmlns:w16sdtfl="http://schemas.microsoft.com/office/word/2024/wordml/sdtformatlock" xmlns:w16se="http://schemas.microsoft.com/office/word/2015/wordml/symex" xmlns:wpg="http://schemas.microsoft.com/office/word/2010/wordprocessingGroup" xmlns:wpi="http://schemas.microsoft.com/office/word/2010/wordprocessingInk" xmlns:wne="http://schemas.microsoft.com/office/word/2006/wordml" xmlns:wps="http://schemas.microsoft.com/office/word/2010/wordprocessingShape" mc:Ignorable="w14 w15 w16se w16cid w16 w16cex w16sdtdh w16sdtfl w16du wp14">
   <w:abstractNum w:abstractNumId="0" w15:restartNumberingAfterBreak="0">
     <w:nsid w:val="07A60CA0"/>
     <w:multiLevelType w:val="multilevel"/>
@@ -9568,6 +9770,7 @@
   <w:style w:type="character" w:default="1" w:styleId="DefaultParagraphFont">
     <w:name w:val="Default Paragraph Font"/>
     <w:uiPriority w:val="1"/>
+    <w:semiHidden/>
     <w:unhideWhenUsed/>
   </w:style>
   <w:style w:type="table" w:default="1" w:styleId="TableNormal">

</xml_diff>